<commit_message>
A lot of changes
a lot of changes but mainly new cards and a new wk/rs system
</commit_message>
<xml_diff>
--- a/Pokemon TCG Generations.docx
+++ b/Pokemon TCG Generations.docx
@@ -22,28 +22,28 @@
         <v:path o:extrusionok="f" gradientshapeok="t" o:connecttype="rect"/>
         <o:lock v:ext="edit" aspectratio="t"/>
       </v:shapetype>
-      <v:shape id="_x0000_i1070" type="#_x0000_t75" style="width:12pt;height:12pt;visibility:visible" o:bullet="t">
+      <v:shape id="_x0000_i1042" type="#_x0000_t75" style="width:12pt;height:12pt;visibility:visible" o:bullet="t">
         <v:imagedata r:id="rId1" o:title=""/>
       </v:shape>
     </w:pict>
   </w:numPicBullet>
   <w:numPicBullet w:numPicBulletId="1">
     <w:pict>
-      <v:shape id="_x0000_i1071" type="#_x0000_t75" style="width:24pt;height:6pt;visibility:visible" o:bullet="t">
+      <v:shape id="_x0000_i1043" type="#_x0000_t75" style="width:24pt;height:6pt;visibility:visible" o:bullet="t">
         <v:imagedata r:id="rId2" o:title=""/>
       </v:shape>
     </w:pict>
   </w:numPicBullet>
   <w:numPicBullet w:numPicBulletId="2">
     <w:pict>
-      <v:shape id="_x0000_i1072" type="#_x0000_t75" style="width:24pt;height:6pt;visibility:visible;mso-wrap-style:square" o:bullet="t">
+      <v:shape id="_x0000_i1044" type="#_x0000_t75" style="width:24pt;height:6pt;visibility:visible;mso-wrap-style:square" o:bullet="t">
         <v:imagedata r:id="rId3" o:title=""/>
       </v:shape>
     </w:pict>
   </w:numPicBullet>
   <w:numPicBullet w:numPicBulletId="3">
     <w:pict>
-      <v:shape id="_x0000_i1073" type="#_x0000_t75" style="width:18pt;height:6pt;visibility:visible;mso-wrap-style:square" o:bullet="t">
+      <v:shape id="_x0000_i1045" type="#_x0000_t75" style="width:18pt;height:6pt;visibility:visible;mso-wrap-style:square" o:bullet="t">
         <v:imagedata r:id="rId4" o:title=""/>
       </v:shape>
     </w:pict>
@@ -269,7 +269,7 @@
     </w:rPrDefault>
     <w:pPrDefault>
       <w:pPr>
-        <w:spacing w:after="120" w:line="276" w:lineRule="auto"/>
+        <w:spacing w:after="200" w:line="276" w:lineRule="auto"/>
       </w:pPr>
     </w:pPrDefault>
   </w:docDefaults>
@@ -1520,7 +1520,7 @@
     <w:name w:val="Table Grid"/>
     <w:basedOn w:val="TableNormal"/>
     <w:uiPriority w:val="39"/>
-    <w:rsid w:val="00626F8B"/>
+    <w:rsid w:val="00D94528"/>
     <w:pPr>
       <w:spacing w:after="0" w:line="240" w:lineRule="auto"/>
     </w:pPr>

</xml_diff>